<commit_message>
Rollback checkpoint: backlog doc-audit cleanup + accumulated source
Doc fixes (this session):
Closes #350: backlog Fixed-section ordering — restored strict descending
Closes #351: backlog suffix-notation policy contradiction (MEMORY.md index)
Closes #361: design-ui.md INSERT column (11 algorithms, dynamic knobs)
Closes #362: design-ui.md filter type list (16 modes, not LP/HP/BP)
Closes #363: design-ui-family.md mixer constants (now proportional)
Closes #364: CLAUDE.md design-doc index — added design-plugin-family.md
Closes #373: design-plugin-family.md SpinLock -> std::atomic<bool>
Closes #374: removed stale TimeSelector references (3 spots)
Closes #375: closed as not-an-issue (DevHistory.md is for major stages only)

Bundles uncommitted source/build state corresponding to backlog fixes
#336-#348 / #381 (already recorded as Fixed in builds 419-432).

Version: v1.0.433
</commit_message>
<xml_diff>
--- a/docs/mu-Clid User Manual.docx
+++ b/docs/mu-Clid User Manual.docx
@@ -38,6 +38,7 @@
         <w:pStyle w:val="Heading1"/>
       </w:pPr>
       <w:r>
+        <w:lastRenderedPageBreak/>
         <w:t>1. Introduction</w:t>
       </w:r>
     </w:p>
@@ -389,7 +390,7 @@
     </w:p>
     <w:p>
       <w:r>
-        <w:t>Shows the rhythm name (double-click to rename), Mute and Solo buttons, and a Delete button. A coloured accent strip on the left identifies the rhythm.</w:t>
+        <w:t>Shows the rhythm name (double-click to rename), Mute and Solo buttons, a Delete button, and a rhythm-preset dropdown that lists .muRhyth files from your Rhythms folder. Selecting a preset loads it into the current rhythm slot immediately (or stages a hot-swap during playback). A coloured accent strip on the left identifies the rhythm.</w:t>
       </w:r>
     </w:p>
     <w:p>
@@ -779,7 +780,15 @@
         <w:pStyle w:val="ListBullet"/>
       </w:pPr>
       <w:r>
-        <w:t>Comb — feedback comb with resonant peaks at multiples of cutoff</w:t>
+        <w:t>Comb + — positive-feedback comb with resonant peaks at multiples of cutoff</w:t>
+      </w:r>
+    </w:p>
+    <w:p>
+      <w:pPr>
+        <w:pStyle w:val="ListBullet"/>
+      </w:pPr>
+      <w:r>
+        <w:t>Comb − — negative-feedback comb; peaks at odd multiples, Karplus-Strong plucked-string character</w:t>
       </w:r>
     </w:p>
     <w:p>
@@ -839,7 +848,7 @@
         <w:pStyle w:val="ListBullet"/>
       </w:pPr>
       <w:r>
-        <w:t>3-Band EQ — low shelf, mid peak, high shelf</w:t>
+        <w:t>3-Band EQ — low shelf, mid peak with adjustable centre frequency, and high shelf</w:t>
       </w:r>
     </w:p>
     <w:p>
@@ -916,7 +925,7 @@
     </w:p>
     <w:p>
       <w:r>
-        <w:t>Three controls (Drive, Output, Tone) re-label themselves to match the algorithm — for example in Bitcrusher mode they become Drive, Bits, and Rate.</w:t>
+        <w:t>Four controls (Drive, Output, Dither, Tone) re-label themselves to match the algorithm — for example in Bitcrusher mode they become Drive (bit depth), Rate (sample rate), Dither, and Tone (LP filter cutoff). In 3-Band EQ mode they become Low, Mid Gain, Mid Hz, and High. A Gain Reduction arc sweeps anti-clockwise over the Output knob when Compressor or Limiter is active.</w:t>
       </w:r>
     </w:p>
     <w:p>
@@ -1011,7 +1020,15 @@
         <w:pStyle w:val="ListBullet"/>
       </w:pPr>
       <w:r>
-        <w:t>A target list with one row per assignment — each row has a destination dropdown and a bipolar depth bar</w:t>
+        <w:t>A target list with one row per assignment — each row shows a row number, a destination dropdown, a bipolar depth bar, and a source-side curve knob (drag to shape the modulation response: positive values are exponential, negative are logarithmic)</w:t>
+      </w:r>
+    </w:p>
+    <w:p>
+      <w:pPr>
+        <w:pStyle w:val="ListBullet"/>
+      </w:pPr>
+      <w:r>
+        <w:t>Pager arrows and a counter appear above the Add Target button when there are more assignments than fit on screen</w:t>
       </w:r>
     </w:p>
     <w:p>
@@ -1071,6 +1088,51 @@
         <w:pStyle w:val="Heading2"/>
       </w:pPr>
       <w:r>
+        <w:t>Meter Mode</w:t>
+      </w:r>
+    </w:p>
+    <w:p>
+      <w:r>
+        <w:t>A SegmentControl at the top of the mixer selects the metering standard applied to every channel, return, and master meter:</w:t>
+      </w:r>
+    </w:p>
+    <w:p>
+      <w:pPr>
+        <w:pStyle w:val="ListBullet"/>
+      </w:pPr>
+      <w:r>
+        <w:t>Peak — instant attack with peak hold and clip LED. Useful for catching transients.</w:t>
+      </w:r>
+    </w:p>
+    <w:p>
+      <w:pPr>
+        <w:pStyle w:val="ListBullet"/>
+      </w:pPr>
+      <w:r>
+        <w:t>VU — 300 ms RMS ballistics matching the classic VU convention. 0 VU is marked at −18 dBFS.</w:t>
+      </w:r>
+    </w:p>
+    <w:p>
+      <w:pPr>
+        <w:pStyle w:val="ListBullet"/>
+      </w:pPr>
+      <w:r>
+        <w:t>K-12 — K-system reference at −12 dBFS. Colour zones shift: green below 0 K, yellow to +4 K, red above.</w:t>
+      </w:r>
+    </w:p>
+    <w:p>
+      <w:pPr>
+        <w:pStyle w:val="ListBullet"/>
+      </w:pPr>
+      <w:r>
+        <w:t>K-14 — K-system reference at −14 dBFS. Headroom reduced; suited to dynamics-heavy material.</w:t>
+      </w:r>
+    </w:p>
+    <w:p>
+      <w:pPr>
+        <w:pStyle w:val="Heading2"/>
+      </w:pPr>
+      <w:r>
         <w:t>Channel Strips</w:t>
       </w:r>
     </w:p>
@@ -1403,6 +1465,11 @@
       </w:r>
     </w:p>
     <w:p>
+      <w:r>
+        <w:t>To load a rhythm preset, use the dropdown in the Rhythm Panel header (labelled 'rhythm preset…'). The dropdown lists all .muRhyth files in your Rhythms folder alphabetically. Selecting one loads it immediately, or stages a hot-swap if playback is running. Right-clicking an item offers Load and Delete options.</w:t>
+      </w:r>
+    </w:p>
+    <w:p>
       <w:pPr>
         <w:pStyle w:val="Heading2"/>
       </w:pPr>
@@ -1659,7 +1726,7 @@
         <w:pStyle w:val="ListBullet"/>
       </w:pPr>
       <w:r>
-        <w:t>Filter types: 15 (LP / HP / BP at 6, 12, and 24 dB per octave; Notch 12/24; AP 12; Comb; Peak; Lo Shelf; Hi Shelf)</w:t>
+        <w:t>Filter types: 16 (LP / HP / BP at 6, 12, and 24 dB per octave; Notch 12/24; AP 12; Comb + / Comb −; Peak; Lo Shelf; Hi Shelf)</w:t>
       </w:r>
     </w:p>
     <w:p>
@@ -1746,7 +1813,7 @@
   <w:abstractNum w:abstractNumId="0" w15:restartNumberingAfterBreak="0">
     <w:nsid w:val="FFFFFF89"/>
     <w:multiLevelType w:val="singleLevel"/>
-    <w:tmpl w:val="415CD446"/>
+    <w:tmpl w:val="4976CAD2"/>
     <w:lvl w:ilvl="0">
       <w:start w:val="1"/>
       <w:numFmt w:val="bullet"/>
@@ -1764,7 +1831,7 @@
       </w:rPr>
     </w:lvl>
   </w:abstractNum>
-  <w:num w:numId="1" w16cid:durableId="354573518">
+  <w:num w:numId="1" w16cid:durableId="4870813">
     <w:abstractNumId w:val="0"/>
   </w:num>
 </w:numbering>
@@ -2178,7 +2245,7 @@
     <w:link w:val="Heading1Char"/>
     <w:uiPriority w:val="9"/>
     <w:qFormat/>
-    <w:rsid w:val="00BB4880"/>
+    <w:rsid w:val="00681251"/>
     <w:pPr>
       <w:keepNext/>
       <w:keepLines/>
@@ -2200,7 +2267,7 @@
     <w:uiPriority w:val="9"/>
     <w:unhideWhenUsed/>
     <w:qFormat/>
-    <w:rsid w:val="00BB4880"/>
+    <w:rsid w:val="00681251"/>
     <w:pPr>
       <w:keepNext/>
       <w:keepLines/>
@@ -2223,7 +2290,7 @@
     <w:semiHidden/>
     <w:unhideWhenUsed/>
     <w:qFormat/>
-    <w:rsid w:val="00BB4880"/>
+    <w:rsid w:val="00681251"/>
     <w:pPr>
       <w:keepNext/>
       <w:keepLines/>
@@ -2246,7 +2313,7 @@
     <w:semiHidden/>
     <w:unhideWhenUsed/>
     <w:qFormat/>
-    <w:rsid w:val="00BB4880"/>
+    <w:rsid w:val="00681251"/>
     <w:pPr>
       <w:keepNext/>
       <w:keepLines/>
@@ -2269,7 +2336,7 @@
     <w:semiHidden/>
     <w:unhideWhenUsed/>
     <w:qFormat/>
-    <w:rsid w:val="00BB4880"/>
+    <w:rsid w:val="00681251"/>
     <w:pPr>
       <w:keepNext/>
       <w:keepLines/>
@@ -2290,7 +2357,7 @@
     <w:semiHidden/>
     <w:unhideWhenUsed/>
     <w:qFormat/>
-    <w:rsid w:val="00BB4880"/>
+    <w:rsid w:val="00681251"/>
     <w:pPr>
       <w:keepNext/>
       <w:keepLines/>
@@ -2313,7 +2380,7 @@
     <w:semiHidden/>
     <w:unhideWhenUsed/>
     <w:qFormat/>
-    <w:rsid w:val="00BB4880"/>
+    <w:rsid w:val="00681251"/>
     <w:pPr>
       <w:keepNext/>
       <w:keepLines/>
@@ -2334,7 +2401,7 @@
     <w:semiHidden/>
     <w:unhideWhenUsed/>
     <w:qFormat/>
-    <w:rsid w:val="00BB4880"/>
+    <w:rsid w:val="00681251"/>
     <w:pPr>
       <w:keepNext/>
       <w:keepLines/>
@@ -2357,7 +2424,7 @@
     <w:semiHidden/>
     <w:unhideWhenUsed/>
     <w:qFormat/>
-    <w:rsid w:val="00BB4880"/>
+    <w:rsid w:val="00681251"/>
     <w:pPr>
       <w:keepNext/>
       <w:keepLines/>
@@ -2401,7 +2468,7 @@
     <w:basedOn w:val="DefaultParagraphFont"/>
     <w:link w:val="Heading1"/>
     <w:uiPriority w:val="9"/>
-    <w:rsid w:val="00BB4880"/>
+    <w:rsid w:val="00681251"/>
     <w:rPr>
       <w:rFonts w:asciiTheme="majorHAnsi" w:eastAsiaTheme="majorEastAsia" w:hAnsiTheme="majorHAnsi" w:cstheme="majorBidi"/>
       <w:color w:val="0F4761" w:themeColor="accent1" w:themeShade="BF"/>
@@ -2414,7 +2481,7 @@
     <w:basedOn w:val="DefaultParagraphFont"/>
     <w:link w:val="Heading2"/>
     <w:uiPriority w:val="9"/>
-    <w:rsid w:val="00BB4880"/>
+    <w:rsid w:val="00681251"/>
     <w:rPr>
       <w:rFonts w:asciiTheme="majorHAnsi" w:eastAsiaTheme="majorEastAsia" w:hAnsiTheme="majorHAnsi" w:cstheme="majorBidi"/>
       <w:color w:val="0F4761" w:themeColor="accent1" w:themeShade="BF"/>
@@ -2428,7 +2495,7 @@
     <w:link w:val="Heading3"/>
     <w:uiPriority w:val="9"/>
     <w:semiHidden/>
-    <w:rsid w:val="00BB4880"/>
+    <w:rsid w:val="00681251"/>
     <w:rPr>
       <w:rFonts w:eastAsiaTheme="majorEastAsia" w:cstheme="majorBidi"/>
       <w:color w:val="0F4761" w:themeColor="accent1" w:themeShade="BF"/>
@@ -2442,7 +2509,7 @@
     <w:link w:val="Heading4"/>
     <w:uiPriority w:val="9"/>
     <w:semiHidden/>
-    <w:rsid w:val="00BB4880"/>
+    <w:rsid w:val="00681251"/>
     <w:rPr>
       <w:rFonts w:eastAsiaTheme="majorEastAsia" w:cstheme="majorBidi"/>
       <w:i/>
@@ -2456,7 +2523,7 @@
     <w:link w:val="Heading5"/>
     <w:uiPriority w:val="9"/>
     <w:semiHidden/>
-    <w:rsid w:val="00BB4880"/>
+    <w:rsid w:val="00681251"/>
     <w:rPr>
       <w:rFonts w:eastAsiaTheme="majorEastAsia" w:cstheme="majorBidi"/>
       <w:color w:val="0F4761" w:themeColor="accent1" w:themeShade="BF"/>
@@ -2468,7 +2535,7 @@
     <w:link w:val="Heading6"/>
     <w:uiPriority w:val="9"/>
     <w:semiHidden/>
-    <w:rsid w:val="00BB4880"/>
+    <w:rsid w:val="00681251"/>
     <w:rPr>
       <w:rFonts w:eastAsiaTheme="majorEastAsia" w:cstheme="majorBidi"/>
       <w:i/>
@@ -2482,7 +2549,7 @@
     <w:link w:val="Heading7"/>
     <w:uiPriority w:val="9"/>
     <w:semiHidden/>
-    <w:rsid w:val="00BB4880"/>
+    <w:rsid w:val="00681251"/>
     <w:rPr>
       <w:rFonts w:eastAsiaTheme="majorEastAsia" w:cstheme="majorBidi"/>
       <w:color w:val="595959" w:themeColor="text1" w:themeTint="A6"/>
@@ -2494,7 +2561,7 @@
     <w:link w:val="Heading8"/>
     <w:uiPriority w:val="9"/>
     <w:semiHidden/>
-    <w:rsid w:val="00BB4880"/>
+    <w:rsid w:val="00681251"/>
     <w:rPr>
       <w:rFonts w:eastAsiaTheme="majorEastAsia" w:cstheme="majorBidi"/>
       <w:i/>
@@ -2508,7 +2575,7 @@
     <w:link w:val="Heading9"/>
     <w:uiPriority w:val="9"/>
     <w:semiHidden/>
-    <w:rsid w:val="00BB4880"/>
+    <w:rsid w:val="00681251"/>
     <w:rPr>
       <w:rFonts w:eastAsiaTheme="majorEastAsia" w:cstheme="majorBidi"/>
       <w:color w:val="272727" w:themeColor="text1" w:themeTint="D8"/>
@@ -2521,7 +2588,7 @@
     <w:link w:val="TitleChar"/>
     <w:uiPriority w:val="10"/>
     <w:qFormat/>
-    <w:rsid w:val="00BB4880"/>
+    <w:rsid w:val="00681251"/>
     <w:pPr>
       <w:spacing w:after="80" w:line="240" w:lineRule="auto"/>
       <w:contextualSpacing/>
@@ -2539,7 +2606,7 @@
     <w:basedOn w:val="DefaultParagraphFont"/>
     <w:link w:val="Title"/>
     <w:uiPriority w:val="10"/>
-    <w:rsid w:val="00BB4880"/>
+    <w:rsid w:val="00681251"/>
     <w:rPr>
       <w:rFonts w:asciiTheme="majorHAnsi" w:eastAsiaTheme="majorEastAsia" w:hAnsiTheme="majorHAnsi" w:cstheme="majorBidi"/>
       <w:spacing w:val="-10"/>
@@ -2555,7 +2622,7 @@
     <w:link w:val="SubtitleChar"/>
     <w:uiPriority w:val="11"/>
     <w:qFormat/>
-    <w:rsid w:val="00BB4880"/>
+    <w:rsid w:val="00681251"/>
     <w:pPr>
       <w:numPr>
         <w:ilvl w:val="1"/>
@@ -2574,7 +2641,7 @@
     <w:basedOn w:val="DefaultParagraphFont"/>
     <w:link w:val="Subtitle"/>
     <w:uiPriority w:val="11"/>
-    <w:rsid w:val="00BB4880"/>
+    <w:rsid w:val="00681251"/>
     <w:rPr>
       <w:rFonts w:eastAsiaTheme="majorEastAsia" w:cstheme="majorBidi"/>
       <w:color w:val="595959" w:themeColor="text1" w:themeTint="A6"/>
@@ -2590,7 +2657,7 @@
     <w:link w:val="QuoteChar"/>
     <w:uiPriority w:val="29"/>
     <w:qFormat/>
-    <w:rsid w:val="00BB4880"/>
+    <w:rsid w:val="00681251"/>
     <w:pPr>
       <w:spacing w:before="160"/>
       <w:jc w:val="center"/>
@@ -2606,7 +2673,7 @@
     <w:basedOn w:val="DefaultParagraphFont"/>
     <w:link w:val="Quote"/>
     <w:uiPriority w:val="29"/>
-    <w:rsid w:val="00BB4880"/>
+    <w:rsid w:val="00681251"/>
     <w:rPr>
       <w:i/>
       <w:iCs/>
@@ -2618,7 +2685,7 @@
     <w:basedOn w:val="Normal"/>
     <w:uiPriority w:val="34"/>
     <w:qFormat/>
-    <w:rsid w:val="00BB4880"/>
+    <w:rsid w:val="00681251"/>
     <w:pPr>
       <w:ind w:left="720"/>
       <w:contextualSpacing/>
@@ -2629,7 +2696,7 @@
     <w:basedOn w:val="DefaultParagraphFont"/>
     <w:uiPriority w:val="21"/>
     <w:qFormat/>
-    <w:rsid w:val="00BB4880"/>
+    <w:rsid w:val="00681251"/>
     <w:rPr>
       <w:i/>
       <w:iCs/>
@@ -2643,7 +2710,7 @@
     <w:link w:val="IntenseQuoteChar"/>
     <w:uiPriority w:val="30"/>
     <w:qFormat/>
-    <w:rsid w:val="00BB4880"/>
+    <w:rsid w:val="00681251"/>
     <w:pPr>
       <w:pBdr>
         <w:top w:val="single" w:sz="4" w:space="10" w:color="0F4761" w:themeColor="accent1" w:themeShade="BF"/>
@@ -2664,7 +2731,7 @@
     <w:basedOn w:val="DefaultParagraphFont"/>
     <w:link w:val="IntenseQuote"/>
     <w:uiPriority w:val="30"/>
-    <w:rsid w:val="00BB4880"/>
+    <w:rsid w:val="00681251"/>
     <w:rPr>
       <w:i/>
       <w:iCs/>
@@ -2676,7 +2743,7 @@
     <w:basedOn w:val="DefaultParagraphFont"/>
     <w:uiPriority w:val="32"/>
     <w:qFormat/>
-    <w:rsid w:val="00BB4880"/>
+    <w:rsid w:val="00681251"/>
     <w:rPr>
       <w:b/>
       <w:bCs/>
@@ -2690,7 +2757,7 @@
     <w:basedOn w:val="Normal"/>
     <w:uiPriority w:val="99"/>
     <w:unhideWhenUsed/>
-    <w:rsid w:val="00BB4880"/>
+    <w:rsid w:val="00681251"/>
     <w:pPr>
       <w:numPr>
         <w:numId w:val="1"/>

</xml_diff>